<commit_message>
docs: atualiza relatorios e papeis de trabalho
</commit_message>
<xml_diff>
--- a/01-Planejamento/03-Estrategia_e_Plano/04-Matriz_Planejamento/02-Matriz de Achados.docx
+++ b/01-Planejamento/03-Estrategia_e_Plano/04-Matriz_Planejamento/02-Matriz de Achados.docx
@@ -2102,7 +2102,7 @@
                 <w:color w:val="000000"/>
                 <w:sz w:val="17"/>
               </w:rPr>
-              <w:t>A organização adota processo formal e padronizado para planejamento, contratação, fiscalização e gestão de soluções de TIC, com participação técnica da área de TIC, alinhamento ao planejamento, requisitos de segurança e critérios objetivos de entrega e desempenho?</w:t>
+              <w:t>A organização adota processo formal e padronizado para planejamento, contratação, fiscalização e gestão de soluções de TIC, com participação técnica da área de TIC e alinhamento ao planejamento?</w:t>
             </w:r>
           </w:p>
         </w:tc>
@@ -2153,141 +2153,23 @@
             </w:tcMar>
           </w:tcPr>
           <w:p>
-            <w:pPr>
-              <w:spacing w:after="80" w:line="252" w:lineRule="auto"/>
-            </w:pPr>
-            <w:r>
-              <w:rPr>
-                <w:rFonts w:ascii="Arial" w:hAnsi="Arial"/>
-                <w:b/>
-                <w:color w:val="000000"/>
-                <w:sz w:val="17"/>
-              </w:rPr>
-              <w:t xml:space="preserve">S6.1. </w:t>
-            </w:r>
-            <w:r>
-              <w:rPr>
-                <w:rFonts w:ascii="Arial" w:hAnsi="Arial"/>
-                <w:b w:val="0"/>
-                <w:color w:val="000000"/>
-                <w:sz w:val="17"/>
-              </w:rPr>
-              <w:t>Inexistência ou fragilidade de processo formal e padronizado para contratações de TIC; [A6]</w:t>
-            </w:r>
-          </w:p>
-          <w:p>
-            <w:pPr>
-              <w:spacing w:after="80" w:line="252" w:lineRule="auto"/>
-            </w:pPr>
-            <w:r>
-              <w:rPr>
-                <w:rFonts w:ascii="Arial" w:hAnsi="Arial"/>
-                <w:b/>
-                <w:color w:val="000000"/>
-                <w:sz w:val="17"/>
-              </w:rPr>
-              <w:t xml:space="preserve">S6.2. </w:t>
-            </w:r>
-            <w:r>
-              <w:rPr>
-                <w:rFonts w:ascii="Arial" w:hAnsi="Arial"/>
-                <w:b w:val="0"/>
-                <w:color w:val="000000"/>
-                <w:sz w:val="17"/>
-              </w:rPr>
-              <w:t>Contratações de TIC sem análise prévia e aprovação técnica obrigatória da área de TIC; [A6]</w:t>
-            </w:r>
-          </w:p>
-          <w:p>
-            <w:pPr>
-              <w:spacing w:after="80" w:line="252" w:lineRule="auto"/>
-            </w:pPr>
-            <w:r>
-              <w:rPr>
-                <w:rFonts w:ascii="Arial" w:hAnsi="Arial"/>
-                <w:b/>
-                <w:color w:val="000000"/>
-                <w:sz w:val="17"/>
-              </w:rPr>
-              <w:t xml:space="preserve">S6.3. </w:t>
-            </w:r>
-            <w:r>
-              <w:rPr>
-                <w:rFonts w:ascii="Arial" w:hAnsi="Arial"/>
-                <w:b w:val="0"/>
-                <w:color w:val="000000"/>
-                <w:sz w:val="17"/>
-              </w:rPr>
-              <w:t>Inexistência ou insuficiência de modelos padronizados para elaboração dos artefatos das contratações de TIC; [A6]</w:t>
-            </w:r>
-          </w:p>
-          <w:p>
-            <w:pPr>
-              <w:spacing w:after="80" w:line="252" w:lineRule="auto"/>
-            </w:pPr>
-            <w:r>
-              <w:rPr>
-                <w:rFonts w:ascii="Arial" w:hAnsi="Arial"/>
-                <w:b/>
-                <w:color w:val="000000"/>
-                <w:sz w:val="17"/>
-              </w:rPr>
-              <w:t xml:space="preserve">S6.4. </w:t>
-            </w:r>
-            <w:r>
-              <w:rPr>
-                <w:rFonts w:ascii="Arial" w:hAnsi="Arial"/>
-                <w:b w:val="0"/>
-                <w:color w:val="000000"/>
-                <w:sz w:val="17"/>
-              </w:rPr>
-              <w:t>Contratações de TIC sem aderência ao plano de TIC ou ao plano de contratações; [A6]</w:t>
-            </w:r>
-          </w:p>
-          <w:p>
-            <w:pPr>
-              <w:spacing w:after="80" w:line="252" w:lineRule="auto"/>
-            </w:pPr>
-            <w:r>
-              <w:rPr>
-                <w:rFonts w:ascii="Arial" w:hAnsi="Arial"/>
-                <w:b/>
-                <w:color w:val="000000"/>
-                <w:sz w:val="17"/>
-              </w:rPr>
-              <w:t xml:space="preserve">S6.5. </w:t>
-            </w:r>
-            <w:r>
-              <w:rPr>
-                <w:rFonts w:ascii="Arial" w:hAnsi="Arial"/>
-                <w:b w:val="0"/>
-                <w:color w:val="000000"/>
-                <w:sz w:val="17"/>
-              </w:rPr>
-              <w:t>Contratações de TIC sem equipe de planejamento formalmente designada e com participação técnica de TIC; [A6]</w:t>
-            </w:r>
-          </w:p>
-          <w:p>
-            <w:pPr>
-              <w:spacing w:after="0" w:line="252" w:lineRule="auto"/>
-            </w:pPr>
-            <w:r>
-              <w:rPr>
-                <w:rFonts w:ascii="Arial" w:hAnsi="Arial"/>
-                <w:b/>
-                <w:color w:val="000000"/>
-                <w:sz w:val="17"/>
-              </w:rPr>
-              <w:t xml:space="preserve">S6.6. </w:t>
-            </w:r>
-            <w:r>
-              <w:rPr>
-                <w:rFonts w:ascii="Arial" w:hAnsi="Arial"/>
-                <w:b w:val="0"/>
-                <w:color w:val="000000"/>
-                <w:sz w:val="17"/>
-              </w:rPr>
-              <w:t>Contratações de TIC sem níveis mínimos de serviço, métricas de desempenho ou critérios objetivos de fiscalização e recebimento; [A6]</w:t>
+            <w:r>
+              <w:t>S6.1. Inexistência ou fragilidade de processo formal e padronizado para contratações de TIC; [A6]</w:t>
+            </w:r>
+          </w:p>
+          <w:p>
+            <w:r>
+              <w:t>S6.2. Contratações de TIC sem análise prévia e aprovação técnica obrigatória da área de TIC; [A6]</w:t>
+            </w:r>
+          </w:p>
+          <w:p>
+            <w:r>
+              <w:t>S6.3. Contratações de TIC sem alinhamento demonstrado ao planejamento de TIC, ao plano de contratações ou à proposta orçamentária; [A6]</w:t>
+            </w:r>
+          </w:p>
+          <w:p>
+            <w:r>
+              <w:t>S6.4. Contratações de TIC sem equipe de planejamento formalmente designada e com participação técnica de TIC; [A6]</w:t>
             </w:r>
           </w:p>
         </w:tc>
@@ -2303,141 +2185,23 @@
             </w:tcMar>
           </w:tcPr>
           <w:p>
-            <w:pPr>
-              <w:spacing w:after="80" w:line="252" w:lineRule="auto"/>
-            </w:pPr>
-            <w:r>
-              <w:rPr>
-                <w:rFonts w:ascii="Arial" w:hAnsi="Arial"/>
-                <w:b/>
-                <w:color w:val="000000"/>
-                <w:sz w:val="17"/>
-              </w:rPr>
-              <w:t xml:space="preserve">E30. </w:t>
-            </w:r>
-            <w:r>
-              <w:rPr>
-                <w:rFonts w:ascii="Arial" w:hAnsi="Arial"/>
-                <w:b w:val="0"/>
-                <w:color w:val="000000"/>
-                <w:sz w:val="17"/>
-              </w:rPr>
-              <w:t>Recomendar que a organização formalize processo de contratação de TIC, contemplando fluxo, etapas, papéis, responsabilidades, modelos mínimos de artefatos, manuais, checklists ou orientações internas; [S6.1]</w:t>
-            </w:r>
-          </w:p>
-          <w:p>
-            <w:pPr>
-              <w:spacing w:after="80" w:line="252" w:lineRule="auto"/>
-            </w:pPr>
-            <w:r>
-              <w:rPr>
-                <w:rFonts w:ascii="Arial" w:hAnsi="Arial"/>
-                <w:b/>
-                <w:color w:val="000000"/>
-                <w:sz w:val="17"/>
-              </w:rPr>
-              <w:t xml:space="preserve">E31. </w:t>
-            </w:r>
-            <w:r>
-              <w:rPr>
-                <w:rFonts w:ascii="Arial" w:hAnsi="Arial"/>
-                <w:b w:val="0"/>
-                <w:color w:val="000000"/>
-                <w:sz w:val="17"/>
-              </w:rPr>
-              <w:t>Recomendar que as contratações de TIC sejam submetidas à análise prévia e aprovação técnica da área de TIC, inclusive quando demandadas por outras áreas da organização; [S6.2]</w:t>
-            </w:r>
-          </w:p>
-          <w:p>
-            <w:pPr>
-              <w:spacing w:after="80" w:line="252" w:lineRule="auto"/>
-            </w:pPr>
-            <w:r>
-              <w:rPr>
-                <w:rFonts w:ascii="Arial" w:hAnsi="Arial"/>
-                <w:b/>
-                <w:color w:val="000000"/>
-                <w:sz w:val="17"/>
-              </w:rPr>
-              <w:t xml:space="preserve">E32. </w:t>
-            </w:r>
-            <w:r>
-              <w:rPr>
-                <w:rFonts w:ascii="Arial" w:hAnsi="Arial"/>
-                <w:b w:val="0"/>
-                <w:color w:val="000000"/>
-                <w:sz w:val="17"/>
-              </w:rPr>
-              <w:t>Recomendar que a organização adote modelos padronizados para DFD/DOD, ETP, TR/projeto básico, pesquisa de preços, mapa de riscos, plano de fiscalização e termos de recebimento; [S6.3]</w:t>
-            </w:r>
-          </w:p>
-          <w:p>
-            <w:pPr>
-              <w:spacing w:after="80" w:line="252" w:lineRule="auto"/>
-            </w:pPr>
-            <w:r>
-              <w:rPr>
-                <w:rFonts w:ascii="Arial" w:hAnsi="Arial"/>
-                <w:b/>
-                <w:color w:val="000000"/>
-                <w:sz w:val="17"/>
-              </w:rPr>
-              <w:t xml:space="preserve">E33. </w:t>
-            </w:r>
-            <w:r>
-              <w:rPr>
-                <w:rFonts w:ascii="Arial" w:hAnsi="Arial"/>
-                <w:b w:val="0"/>
-                <w:color w:val="000000"/>
-                <w:sz w:val="17"/>
-              </w:rPr>
-              <w:t>Recomendar que a organização condicione as contratações de TIC à vinculação com o planejamento de TIC e com o plano de contratações, ressalvadas situações excepcionais devidamente justificadas; [S6.4]</w:t>
-            </w:r>
-          </w:p>
-          <w:p>
-            <w:pPr>
-              <w:spacing w:after="80" w:line="252" w:lineRule="auto"/>
-            </w:pPr>
-            <w:r>
-              <w:rPr>
-                <w:rFonts w:ascii="Arial" w:hAnsi="Arial"/>
-                <w:b/>
-                <w:color w:val="000000"/>
-                <w:sz w:val="17"/>
-              </w:rPr>
-              <w:t xml:space="preserve">E34. </w:t>
-            </w:r>
-            <w:r>
-              <w:rPr>
-                <w:rFonts w:ascii="Arial" w:hAnsi="Arial"/>
-                <w:b w:val="0"/>
-                <w:color w:val="000000"/>
-                <w:sz w:val="17"/>
-              </w:rPr>
-              <w:t>Recomendar que a organização designe formalmente equipe de planejamento da contratação de TIC, com participação da área requisitante, área técnica de TIC e demais áreas necessárias; [S6.5]</w:t>
-            </w:r>
-          </w:p>
-          <w:p>
-            <w:pPr>
-              <w:spacing w:after="0" w:line="252" w:lineRule="auto"/>
-            </w:pPr>
-            <w:r>
-              <w:rPr>
-                <w:rFonts w:ascii="Arial" w:hAnsi="Arial"/>
-                <w:b/>
-                <w:color w:val="000000"/>
-                <w:sz w:val="17"/>
-              </w:rPr>
-              <w:t xml:space="preserve">E35. </w:t>
-            </w:r>
-            <w:r>
-              <w:rPr>
-                <w:rFonts w:ascii="Arial" w:hAnsi="Arial"/>
-                <w:b w:val="0"/>
-                <w:color w:val="000000"/>
-                <w:sz w:val="17"/>
-              </w:rPr>
-              <w:t>Recomendar que os TRs, projetos básicos, contratos ou instrumentos equivalentes de TIC estabeleçam níveis mínimos de serviço, indicadores, critérios de medição, critérios de recebimento e vinculação do pagamento à efetiva entrega de resultados ou níveis de qualidade; [S6.6]</w:t>
+            <w:r>
+              <w:t>E30. Recomendar que a organização formalize processo de contratação de TIC, contemplando fluxo, etapas, papéis, responsabilidades, modelos mínimos de artefatos, manuais, checklists ou orientações internas; [S6.1]</w:t>
+            </w:r>
+          </w:p>
+          <w:p>
+            <w:r>
+              <w:t>E31. Recomendar que as contratações de TIC sejam submetidas à análise prévia e aprovação técnica da área de TIC, inclusive quando demandadas por outras áreas da organização; [S6.2]</w:t>
+            </w:r>
+          </w:p>
+          <w:p>
+            <w:r>
+              <w:t>E32. Recomendar que a organização integre as contratações de TIC ao planejamento de TIC, ao plano de contratações e à proposta orçamentária; [S6.3]</w:t>
+            </w:r>
+          </w:p>
+          <w:p>
+            <w:r>
+              <w:t>E33. Recomendar que a organização designe formalmente equipe de planejamento da contratação de TIC, com participação da área requisitante, área técnica de TIC e demais áreas necessárias; [S6.4]</w:t>
             </w:r>
           </w:p>
         </w:tc>

</xml_diff>